<commit_message>
feat: add french template #BKDO-210
</commit_message>
<xml_diff>
--- a/src/Bk.APG.Api/Templates/APG_Decision_Federal_Council_German.docx
+++ b/src/Bk.APG.Api/Templates/APG_Decision_Federal_Council_German.docx
@@ -370,7 +370,7 @@
         <w:rPr>
           <w:szCs w:val="24"/>
         </w:rPr>
-        <w:t>Die Ernennung der Mitglieder erfolgt getrennt in den folgenden Organen:</w:t>
+        <w:t>Folgende Gremien werden nicht oder zu einem späteren Zeitpunkt bestellt:</w:t>
       </w:r>
     </w:p>
     <w:p>
@@ -1495,6 +1495,30 @@
     <w:p>
       <w:pPr>
         <w:pStyle w:val="Listenabsatz"/>
+        <w:numPr>
+          <w:ilvl w:val="1"/>
+          <w:numId w:val="17"/>
+        </w:numPr>
+        <w:rPr>
+          <w:szCs w:val="24"/>
+        </w:rPr>
+      </w:pPr>
+      <w:r>
+        <w:rPr>
+          <w:szCs w:val="24"/>
+        </w:rPr>
+        <w:t>D</w:t>
+      </w:r>
+      <w:r>
+        <w:rPr>
+          <w:szCs w:val="24"/>
+        </w:rPr>
+        <w:t>ie BK wird ermächtigt, die publizierte Mitgliederliste im Einvernehmen mit dem zuständigen Departement anzupassen, falls sich Änderungen betreffend die Angaben zu den gewählten Personen ergeben.</w:t>
+      </w:r>
+    </w:p>
+    <w:p>
+      <w:pPr>
+        <w:pStyle w:val="Listenabsatz"/>
         <w:rPr>
           <w:szCs w:val="24"/>
         </w:rPr>
@@ -1541,7 +1565,64 @@
         <w:rPr>
           <w:szCs w:val="24"/>
         </w:rPr>
-        <w:t xml:space="preserve">Die BK wird beauftragt, dem Bundesrat zuhanden der eidgenössischen Räte bis zum 31. März 2020 einen Bericht über die Zusammensetzung der ständigen ausserparlamentarischen Gremien für die Amtsperiode </w:t>
+        <w:t xml:space="preserve">Die BK wird beauftragt, dem Bundesrat zuhanden der eidgenössischen Räte bis zum </w:t>
+      </w:r>
+      <w:r>
+        <w:rPr>
+          <w:szCs w:val="24"/>
+        </w:rPr>
+        <w:fldChar w:fldCharType="begin">
+          <w:ffData>
+            <w:name w:val=""/>
+            <w:enabled/>
+            <w:calcOnExit w:val="0"/>
+            <w:textInput>
+              <w:default w:val="[Datum]"/>
+            </w:textInput>
+          </w:ffData>
+        </w:fldChar>
+      </w:r>
+      <w:r>
+        <w:rPr>
+          <w:szCs w:val="24"/>
+        </w:rPr>
+        <w:instrText xml:space="preserve"> FORMTEXT </w:instrText>
+      </w:r>
+      <w:r>
+        <w:rPr>
+          <w:szCs w:val="24"/>
+        </w:rPr>
+      </w:r>
+      <w:r>
+        <w:rPr>
+          <w:szCs w:val="24"/>
+        </w:rPr>
+        <w:fldChar w:fldCharType="separate"/>
+      </w:r>
+      <w:r>
+        <w:rPr>
+          <w:noProof/>
+          <w:szCs w:val="24"/>
+        </w:rPr>
+        <w:t>[Datum/Uhrzeit]</w:t>
+      </w:r>
+      <w:r>
+        <w:rPr>
+          <w:szCs w:val="24"/>
+        </w:rPr>
+        <w:fldChar w:fldCharType="end"/>
+      </w:r>
+      <w:r>
+        <w:rPr>
+          <w:szCs w:val="24"/>
+        </w:rPr>
+        <w:t xml:space="preserve"> </w:t>
+      </w:r>
+      <w:r>
+        <w:rPr>
+          <w:szCs w:val="24"/>
+        </w:rPr>
+        <w:t xml:space="preserve">einen Bericht über die Zusammensetzung der ständigen ausserparlamentarischen Gremien für die Amtsperiode </w:t>
       </w:r>
       <w:r>
         <w:t>&lt;&lt;[</w:t>
@@ -6226,7 +6307,6 @@
   <w:style w:type="character" w:default="1" w:styleId="Absatz-Standardschriftart">
     <w:name w:val="Default Paragraph Font"/>
     <w:uiPriority w:val="1"/>
-    <w:semiHidden/>
     <w:unhideWhenUsed/>
   </w:style>
   <w:style w:type="table" w:default="1" w:styleId="NormaleTabelle">
@@ -6797,7 +6877,7 @@
 </file>
 
 <file path=customXml/item1.xml><?xml version="1.0" encoding="utf-8"?>
-<officeatwork xmlns="http://schemas.officeatwork.com/Formulas">eNp7v3u/jVt+UW5pTmKxgr4dAD33Bnw=</officeatwork>
+<officeatwork xmlns="http://schemas.officeatwork.com/Document">eNp7v3u/jUt+cmlual6JnU1wfk5pSWZ+nmeKXVK2jT4S18YnMS+9NDE91c7IwNTURh/OtQnLTC23s9GHUnCzAA5cIJ8=</officeatwork>
 </file>
 
 <file path=customXml/item2.xml><?xml version="1.0" encoding="utf-8"?>
@@ -6805,7 +6885,7 @@
 </file>
 
 <file path=customXml/item3.xml><?xml version="1.0" encoding="utf-8"?>
-<officeatwork xmlns="http://schemas.officeatwork.com/Document">eNp7v3u/jUt+cmlual6JnU1wfk5pSWZ+nmeKXVK2jT4S18YnMS+9NDE91c7IwNTURh/OtQnLTC23s9GHUnCzAA5cIJ8=</officeatwork>
+<officeatwork xmlns="http://schemas.officeatwork.com/Formulas">eNp7v3u/jVt+UW5pTmKxgr4dAD33Bnw=</officeatwork>
 </file>
 
 <file path=customXml/item4.xml><?xml version="1.0" encoding="utf-8"?>
@@ -6862,9 +6942,9 @@
 </file>
 
 <file path=customXml/itemProps1.xml><?xml version="1.0" encoding="utf-8"?>
-<ds:datastoreItem xmlns:ds="http://schemas.openxmlformats.org/officeDocument/2006/customXml" ds:itemID="{FACC0E0D-5C77-45BD-958B-944424F72D0B}">
+<ds:datastoreItem xmlns:ds="http://schemas.openxmlformats.org/officeDocument/2006/customXml" ds:itemID="{826A14BC-61C7-4B5E-A710-1212315CFB87}">
   <ds:schemaRefs>
-    <ds:schemaRef ds:uri="http://schemas.officeatwork.com/Formulas"/>
+    <ds:schemaRef ds:uri="http://schemas.officeatwork.com/Document"/>
   </ds:schemaRefs>
 </ds:datastoreItem>
 </file>
@@ -6878,9 +6958,9 @@
 </file>
 
 <file path=customXml/itemProps3.xml><?xml version="1.0" encoding="utf-8"?>
-<ds:datastoreItem xmlns:ds="http://schemas.openxmlformats.org/officeDocument/2006/customXml" ds:itemID="{826A14BC-61C7-4B5E-A710-1212315CFB87}">
+<ds:datastoreItem xmlns:ds="http://schemas.openxmlformats.org/officeDocument/2006/customXml" ds:itemID="{FACC0E0D-5C77-45BD-958B-944424F72D0B}">
   <ds:schemaRefs>
-    <ds:schemaRef ds:uri="http://schemas.officeatwork.com/Document"/>
+    <ds:schemaRef ds:uri="http://schemas.officeatwork.com/Formulas"/>
   </ds:schemaRefs>
 </ds:datastoreItem>
 </file>

</xml_diff>